<commit_message>
Make session cookies work correctly over HTTP and HTTPS
Update API server to trust proxy headers and conditionally set secure cookie flag; update deployment documentation to reflect new COOKIE_SECURE environment variable.

Replit-Commit-Author: Agent
Replit-Commit-Session-Id: 5b307ee4-5324-482f-b5c9-7c1c141b2bfe
Replit-Commit-Checkpoint-Type: full_checkpoint
Replit-Commit-Event-Id: 97de1e57-a892-45de-a62e-0e275b9e0e3a
Replit-Commit-Screenshot-Url: https://storage.googleapis.com/screenshot-production-us-central1/ef47cb84-7ce9-4fd2-b01a-574522ad297a/5b307ee4-5324-482f-b5c9-7c1c141b2bfe/tFAmu2Q
Replit-Helium-Checkpoint-Created: true
</commit_message>
<xml_diff>
--- a/facadebot_install_guide.docx
+++ b/facadebot_install_guide.docx
@@ -1069,6 +1069,21 @@
           <w:szCs w:val="20"/>
         </w:rPr>
         <w:t xml:space="preserve">ADMIN_PASSWORD=замените_на_надёжный_пароль</w:t>
+      </w:r>
+    </w:p>
+    <w:p>
+      <w:pPr>
+        <w:shd w:fill="F2F2F2" w:color="F2F2F2" w:val="solid"/>
+        <w:spacing w:after="40" w:before="40"/>
+        <w:ind w:left="360" w:right="360"/>
+      </w:pPr>
+      <w:r>
+        <w:rPr>
+          <w:rFonts w:ascii="Courier New" w:cs="Courier New" w:eastAsia="Courier New" w:hAnsi="Courier New"/>
+          <w:sz w:val="20"/>
+          <w:szCs w:val="20"/>
+        </w:rPr>
+        <w:t xml:space="preserve"># COOKIE_SECURE=true  # раскомментируйте только при наличии HTTPS</w:t>
       </w:r>
     </w:p>
     <w:p>
@@ -1512,6 +1527,44 @@
                 <w:sz w:val="18"/>
                 <w:szCs w:val="18"/>
               </w:rPr>
+              <w:t xml:space="preserve">COOKIE_SECURE</w:t>
+            </w:r>
+          </w:p>
+        </w:tc>
+        <w:tc>
+          <w:p>
+            <w:r>
+              <w:rPr>
+                <w:rFonts w:ascii="Calibri" w:cs="Calibri" w:eastAsia="Calibri" w:hAnsi="Calibri"/>
+                <w:sz w:val="20"/>
+                <w:szCs w:val="20"/>
+              </w:rPr>
+              <w:t xml:space="preserve">Нет</w:t>
+            </w:r>
+          </w:p>
+        </w:tc>
+        <w:tc>
+          <w:p>
+            <w:r>
+              <w:rPr>
+                <w:rFonts w:ascii="Calibri" w:cs="Calibri" w:eastAsia="Calibri" w:hAnsi="Calibri"/>
+                <w:sz w:val="20"/>
+                <w:szCs w:val="20"/>
+              </w:rPr>
+              <w:t xml:space="preserve">Установите true ТОЛЬКО при наличии HTTPS. При HTTP оставьте пустым или false</w:t>
+            </w:r>
+          </w:p>
+        </w:tc>
+      </w:tr>
+      <w:tr>
+        <w:tc>
+          <w:p>
+            <w:r>
+              <w:rPr>
+                <w:rFonts w:ascii="Courier New" w:cs="Courier New" w:eastAsia="Courier New" w:hAnsi="Courier New"/>
+                <w:sz w:val="18"/>
+                <w:szCs w:val="18"/>
+              </w:rPr>
               <w:t xml:space="preserve">TELEGRAM_BOT_TOKEN</w:t>
             </w:r>
           </w:p>

</xml_diff>